<commit_message>
minor desc cahgnes to docx
</commit_message>
<xml_diff>
--- a/Sprawozdanie_Tydz_3.docx
+++ b/Sprawozdanie_Tydz_3.docx
@@ -313,10 +313,7 @@
         <w:jc w:val="both"/>
       </w:pPr>
       <w:r>
-        <w:t>Po uruchomieniu agent wykonał metodę setup(), która wypisała „startuję” i wywołała doDelete(). P</w:t>
-      </w:r>
-      <w:r>
-        <w:t>rzed usunięciem agenta platforma JADE wywołała metodę takeDown(), dlatego w konsoli pojawił się komunikat „zaraz się usunę”.</w:t>
+        <w:t>Po uruchomieniu agent wykonał metodę setup(), która wypisała „startuję” i wywołała doDelete(). Przed usunięciem agenta platforma JADE wywołała metodę takeDown(), dlatego w konsoli pojawił się komunikat „zaraz się usunę”.</w:t>
       </w:r>
     </w:p>
     <w:p>
@@ -334,10 +331,7 @@
         </w:numPr>
       </w:pPr>
       <w:r>
-        <w:t>U</w:t>
-      </w:r>
-      <w:r>
-        <w:t>twórz klasę agenta klasa_2 na podstawie klasa_1 i dodaj zachowanie jednokrotnie wypisujące „wykonuję”.</w:t>
+        <w:t>Utwórz klasę agenta klasa_2 na podstawie klasa_1 i dodaj zachowanie jednokrotnie wypisujące „wykonuję”.</w:t>
       </w:r>
     </w:p>
     <w:p>
@@ -429,10 +423,7 @@
         <w:jc w:val="both"/>
       </w:pPr>
       <w:r>
-        <w:t>Zachowanie typu OneShotBehaviour zostało wykonane dokładnie raz i wypisało „wykonuję” pomiędzy komunikatami startu i usunięcia agenta. Po jego wykonaniu agent wywołał doDelete(), więc zakończył działanie i wypisał „zaraz się u</w:t>
-      </w:r>
-      <w:r>
-        <w:t>sunę”.</w:t>
+        <w:t>Zachowanie typu OneShotBehaviour zostało wykonane dokładnie raz i wypisało „wykonuję” pomiędzy komunikatami startu i usunięcia agenta. Po jego wykonaniu agent wywołał doDelete(), więc zakończył działanie i wypisał „zaraz się usunę”.</w:t>
       </w:r>
     </w:p>
     <w:p>
@@ -624,17 +615,8 @@
           <w:i/>
           <w:iCs/>
         </w:rPr>
-        <w:t xml:space="preserve"> w </w:t>
-      </w:r>
-      <w:proofErr w:type="spellStart"/>
-      <w:r>
-        <w:rPr>
-          <w:i/>
-          <w:iCs/>
-        </w:rPr>
-        <w:t>Introspektorze</w:t>
-      </w:r>
-      <w:proofErr w:type="spellEnd"/>
+        <w:t xml:space="preserve"> w Introspektorze</w:t>
+      </w:r>
     </w:p>
     <w:p>
       <w:pPr>
@@ -647,16 +629,7 @@
         <w:jc w:val="both"/>
       </w:pPr>
       <w:r>
-        <w:t>Zachowanie typu CyclicBehaviour nig</w:t>
-      </w:r>
-      <w:r>
-        <w:t>dy się nie kończy, dlatego „wykonuję” jest wypisywane co sekundę aż do ręcznego usunięcia agenta. W Introspektorze w puli zachowań agenta agent3 widoczne jest jedno zachowanie</w:t>
-      </w:r>
-      <w:r>
-        <w:t xml:space="preserve"> klasa_3$1 typu CyclicBehaviour, a panele wiadomości są puste, ponieważ age</w:t>
-      </w:r>
-      <w:r>
-        <w:t>nt nie wysyła ani nie odbiera komunikatów.</w:t>
+        <w:t>Zachowanie typu CyclicBehaviour nigdy się nie kończy, dlatego „wykonuję” jest wypisywane co sekundę aż do ręcznego usunięcia agenta. W Introspektorze w puli zachowań agenta agent3 widoczne jest jedno zachowanie klasa_3$1 typu CyclicBehaviour, a panele wiadomości są puste, ponieważ agent nie wysyła ani nie odbiera komunikatów.</w:t>
       </w:r>
     </w:p>
     <w:p>
@@ -751,7 +724,21 @@
           <w:i/>
           <w:iCs/>
         </w:rPr>
-        <w:t xml:space="preserve"> klasa4</w:t>
+        <w:t xml:space="preserve"> klasa</w:t>
+      </w:r>
+      <w:r>
+        <w:rPr>
+          <w:i/>
+          <w:iCs/>
+        </w:rPr>
+        <w:t>_</w:t>
+      </w:r>
+      <w:r>
+        <w:rPr>
+          <w:i/>
+          <w:iCs/>
+        </w:rPr>
+        <w:t>4</w:t>
       </w:r>
     </w:p>
     <w:p>
@@ -776,10 +763,7 @@
       </w:pPr>
       <w:r>
         <w:lastRenderedPageBreak/>
-        <w:t>Zachowanie generyczne wykonało k</w:t>
-      </w:r>
-      <w:r>
-        <w:t>olejno trzy kroki, a po trzecim metoda done() zwróciła true i zachowanie zostało usunięte z puli. Agent działał dalej bez aktywnych zachowań, a komunikat „zaraz się usunę” pojawił się dopiero po jego ręcznym usunięciu.</w:t>
+        <w:t>Zachowanie generyczne wykonało kolejno trzy kroki, a po trzecim metoda done() zwróciła true i zachowanie zostało usunięte z puli. Agent działał dalej bez aktywnych zachowań, a komunikat „zaraz się usunę” pojawił się dopiero po jego ręcznym usunięciu.</w:t>
       </w:r>
     </w:p>
     <w:p>
@@ -797,10 +781,7 @@
         </w:numPr>
       </w:pPr>
       <w:r>
-        <w:t>Utwórz klasę agenta klasa_5 na podst</w:t>
-      </w:r>
-      <w:r>
-        <w:t>awie klasa_1 i dodaj zachowanie pobierające z klawiatury liczbę całkowitą</w:t>
+        <w:t>Utwórz klasę agenta klasa_5 na podstawie klasa_1 i dodaj zachowanie pobierające z klawiatury liczbę całkowitą</w:t>
       </w:r>
       <w:r>
         <w:t>. P</w:t>
@@ -886,7 +867,21 @@
           <w:i/>
           <w:iCs/>
         </w:rPr>
-        <w:t xml:space="preserve"> klasa5</w:t>
+        <w:t xml:space="preserve"> klasa</w:t>
+      </w:r>
+      <w:r>
+        <w:rPr>
+          <w:i/>
+          <w:iCs/>
+        </w:rPr>
+        <w:t>_</w:t>
+      </w:r>
+      <w:r>
+        <w:rPr>
+          <w:i/>
+          <w:iCs/>
+        </w:rPr>
+        <w:t>5</w:t>
       </w:r>
     </w:p>
     <w:p>
@@ -1048,7 +1043,21 @@
           <w:i/>
           <w:iCs/>
         </w:rPr>
-        <w:t xml:space="preserve"> klasa6</w:t>
+        <w:t xml:space="preserve"> klasa</w:t>
+      </w:r>
+      <w:r>
+        <w:rPr>
+          <w:i/>
+          <w:iCs/>
+        </w:rPr>
+        <w:t>_</w:t>
+      </w:r>
+      <w:r>
+        <w:rPr>
+          <w:i/>
+          <w:iCs/>
+        </w:rPr>
+        <w:t>6</w:t>
       </w:r>
     </w:p>
     <w:p>
@@ -1062,38 +1071,19 @@
         <w:jc w:val="both"/>
       </w:pPr>
       <w:r>
-        <w:t xml:space="preserve">Komunikat „zachowanie startuje” pochodzi z metody </w:t>
-      </w:r>
-      <w:proofErr w:type="spellStart"/>
-      <w:r>
-        <w:t>onStart</w:t>
-      </w:r>
-      <w:proofErr w:type="spellEnd"/>
-      <w:r>
-        <w:t xml:space="preserve">(), </w:t>
+        <w:t xml:space="preserve">Komunikat „zachowanie startuje” pochodzi z metody onStart(), </w:t>
       </w:r>
       <w:r>
         <w:t>która jest wywoływana</w:t>
       </w:r>
       <w:r>
-        <w:t xml:space="preserve"> </w:t>
-      </w:r>
-      <w:r>
-        <w:t xml:space="preserve">jeden raz przed pierwszym wykonaniem metody action(). Po podaniu liczby ujemnej </w:t>
+        <w:t xml:space="preserve"> jeden raz przed pierwszym wykonaniem metody action(). Po podaniu liczby ujemnej </w:t>
       </w:r>
       <w:r>
         <w:t xml:space="preserve">   </w:t>
       </w:r>
       <w:r>
-        <w:t xml:space="preserve">(-5) metoda </w:t>
-      </w:r>
-      <w:proofErr w:type="spellStart"/>
-      <w:r>
-        <w:t>done</w:t>
-      </w:r>
-      <w:proofErr w:type="spellEnd"/>
-      <w:r>
-        <w:t xml:space="preserve">() zwróciła true i przed usunięciem zachowania została wywołana metoda onEnd(), która wypisała „zachowanie zakończone”. </w:t>
+        <w:t xml:space="preserve">(-5) metoda done() zwróciła true i przed usunięciem zachowania została wywołana metoda onEnd(), która wypisała „zachowanie zakończone”. </w:t>
       </w:r>
     </w:p>
     <w:p>
@@ -1201,14 +1191,14 @@
           <w:i/>
           <w:iCs/>
         </w:rPr>
-        <w:t>R</w:t>
+        <w:t>Rys. 8. Informacje z konsoli</w:t>
       </w:r>
       <w:r>
         <w:rPr>
           <w:i/>
           <w:iCs/>
         </w:rPr>
-        <w:t>ys. 8. Informacje z konsoli</w:t>
+        <w:t xml:space="preserve"> klasa_7</w:t>
       </w:r>
     </w:p>
     <w:p>
@@ -1222,13 +1212,7 @@
         <w:jc w:val="both"/>
       </w:pPr>
       <w:r>
-        <w:t>Planista agenta wykonuje zachowania naprzemie</w:t>
-      </w:r>
-      <w:r>
-        <w:t>nnie, dlatego po pierwszym kroku zachowania generycznego wykonało się zachowanie „pierwsze” dodane w setup(), a następnie „drugie” dodane w trakcie pierwszego kroku. Dopiero potem zachowanie generyczne wykonało swój drugi i trzeci krok i zostało usunięte z</w:t>
-      </w:r>
-      <w:r>
-        <w:t xml:space="preserve"> puli.</w:t>
+        <w:t>Planista agenta wykonuje zachowania naprzemiennie, dlatego po pierwszym kroku zachowania generycznego wykonało się zachowanie „pierwsze” dodane w setup(), a następnie „drugie” dodane w trakcie pierwszego kroku. Dopiero potem zachowanie generyczne wykonało swój drugi i trzeci krok i zostało usunięte z puli.</w:t>
       </w:r>
     </w:p>
     <w:p>
@@ -1367,14 +1351,21 @@
           <w:i/>
           <w:iCs/>
         </w:rPr>
-        <w:t>R</w:t>
+        <w:t>Rys. 9. Informacje z konsoli klasa</w:t>
       </w:r>
       <w:r>
         <w:rPr>
           <w:i/>
           <w:iCs/>
         </w:rPr>
-        <w:t>ys. 9. Informacje z konsoli klasa8 – moment usunięcia zachowania b</w:t>
+        <w:t>_</w:t>
+      </w:r>
+      <w:r>
+        <w:rPr>
+          <w:i/>
+          <w:iCs/>
+        </w:rPr>
+        <w:t>8 – moment usunięcia zachowania b</w:t>
       </w:r>
     </w:p>
     <w:p>
@@ -1445,7 +1436,35 @@
           <w:i/>
           <w:iCs/>
         </w:rPr>
-        <w:t>Rys. 10. Informacje z konsoli klasa8 – moment usunięcia agenta</w:t>
+        <w:t>Rys. 10. Informacje z konsoli klasa</w:t>
+      </w:r>
+      <w:r>
+        <w:rPr>
+          <w:i/>
+          <w:iCs/>
+        </w:rPr>
+        <w:t>_</w:t>
+      </w:r>
+      <w:r>
+        <w:rPr>
+          <w:i/>
+          <w:iCs/>
+        </w:rPr>
+        <w:t xml:space="preserve">8 – moment </w:t>
+      </w:r>
+      <w:r>
+        <w:rPr>
+          <w:i/>
+          <w:iCs/>
+        </w:rPr>
+        <w:t>zatrzymania</w:t>
+      </w:r>
+      <w:r>
+        <w:rPr>
+          <w:i/>
+          <w:iCs/>
+        </w:rPr>
+        <w:t xml:space="preserve"> agenta</w:t>
       </w:r>
     </w:p>
     <w:p>
@@ -1515,23 +1534,7 @@
           <w:i/>
           <w:iCs/>
         </w:rPr>
-        <w:t xml:space="preserve">Rys. 11. Widok w </w:t>
-      </w:r>
-      <w:proofErr w:type="spellStart"/>
-      <w:r>
-        <w:rPr>
-          <w:i/>
-          <w:iCs/>
-        </w:rPr>
-        <w:t>Introspektorze</w:t>
-      </w:r>
-      <w:proofErr w:type="spellEnd"/>
-      <w:r>
-        <w:rPr>
-          <w:i/>
-          <w:iCs/>
-        </w:rPr>
-        <w:t xml:space="preserve"> agent8</w:t>
+        <w:t>Rys. 11. Widok w Introspektorze agent8</w:t>
       </w:r>
     </w:p>
     <w:p>
@@ -1545,10 +1548,7 @@
         <w:jc w:val="both"/>
       </w:pPr>
       <w:r>
-        <w:t>Zachowania typu TickerBehaviour wypisywały komunikaty co 2 i 5 sekund, a zachowania typu WakerBehaviour po 50 sekundach usunęły zachowanie „duży tick”, a po 100 sekundach wywołały doDelete(), co zakończyło się komunikatem „zaraz się usunę”. W Introspektorz</w:t>
-      </w:r>
-      <w:r>
-        <w:t>e w puli agenta agent8 widoczne są cztery zachowania – dwa typu TickerBehaviour i dwa typu WakerBehaviour – a agent pozostaje w stanie Idle, ponieważ między kolejnymi tickami czeka na upływ czasu.</w:t>
+        <w:t>Zachowania typu TickerBehaviour wypisywały komunikaty co 2 i 5 sekund, a zachowania typu WakerBehaviour po 50 sekundach usunęły zachowanie „duży tick”, a po 100 sekundach wywołały doDelete(), co zakończyło się komunikatem „zaraz się usunę”. W Introspektorze w puli agenta agent8 widoczne są cztery zachowania – dwa typu TickerBehaviour i dwa typu WakerBehaviour – a agent pozostaje w stanie Idle, ponieważ między kolejnymi tickami czeka na upływ czasu.</w:t>
       </w:r>
     </w:p>
     <w:p>
@@ -1574,10 +1574,7 @@
         <w:jc w:val="both"/>
       </w:pPr>
       <w:r>
-        <w:t xml:space="preserve">Działanie agenta w JADE definiuje się jako zestaw </w:t>
-      </w:r>
-      <w:r>
-        <w:t>zachowań, które planista agenta wykonuje naprzemiennie, a metody setup() i takeDown() pozwalają obsłużyć początek i koniec życia agenta.</w:t>
+        <w:t>Działanie agenta w JADE definiuje się jako zestaw zachowań, które planista agenta wykonuje naprzemiennie, a metody setup() i takeDown() pozwalają obsłużyć początek i koniec życia agenta.</w:t>
       </w:r>
     </w:p>
     <w:p>
@@ -1595,10 +1592,7 @@
         <w:jc w:val="both"/>
       </w:pPr>
       <w:r>
-        <w:t>Zachowania TickerBehaviour i WakerBehaviour pozwalają wykonywać działania cykl</w:t>
-      </w:r>
-      <w:r>
-        <w:t>icznie co zadany czas lub jednorazowo po upływie określonego czasu.</w:t>
+        <w:t>Zachowania TickerBehaviour i WakerBehaviour pozwalają wykonywać działania cyklicznie co zadany czas lub jednorazowo po upływie określonego czasu.</w:t>
       </w:r>
     </w:p>
     <w:p>

</xml_diff>